<commit_message>
Add project partner Abhishek Mundanat to report, slides and README
</commit_message>
<xml_diff>
--- a/report/report.docx
+++ b/report/report.docx
@@ -84,7 +84,7 @@
           <w:sz w:val="26"/>
           <w:szCs w:val="26"/>
         </w:rPr>
-        <w:t xml:space="preserve">Ashwin Anand</w:t>
+        <w:t xml:space="preserve">Ashwin Anand  (SRN: PES1UG24AM057)</w:t>
       </w:r>
     </w:p>
     <w:p>
@@ -94,10 +94,12 @@
       </w:pPr>
       <w:r>
         <w:rPr>
-          <w:sz w:val="24"/>
-          <w:szCs w:val="24"/>
+          <w:b/>
+          <w:bCs/>
+          <w:sz w:val="26"/>
+          <w:szCs w:val="26"/>
         </w:rPr>
-        <w:t xml:space="preserve">SRN: PES1UG24AM057</w:t>
+        <w:t xml:space="preserve">Abhishek Mundanat  (SRN: PES1UG24AM012)</w:t>
       </w:r>
     </w:p>
     <w:p>

</xml_diff>